<commit_message>
docs(entrega): dossier Milestone 2 al corte final (16-ago) + docs de traspaso
- render_dossier.py: parches del corte final sobre contenido.py (congelado al 1-ago):
  encabezado, semanas 5-7 y adendas. Regenera docx/md/pdf.
- ATHOS-TRASPASO-TECNICO.md + ATHOS-DOCUMENTACION.html: documentacion de traspaso
  (tecnica + didactica). CAPA-AGENTICA-ESTADO.md: estado de la capa agentica del front.

No toca codigo del servicio ni del front: solo entregables bajo docs/entrega/.

Co-Authored-By: Claude Opus 4.8 <noreply@anthropic.com>
Claude-Session: https://claude.ai/code/session_011ZuDT9UiMJDDjRVJVtVSeJ
</commit_message>
<xml_diff>
--- a/docs/entrega/DOSSIER-EVIDENCIAS-MILESTONE2.docx
+++ b/docs/entrega/DOSSIER-EVIDENCIAS-MILESTONE2.docx
@@ -12,7 +12,7 @@
     </w:p>
     <w:p>
       <w:r>
-        <w:t>Contrato COT-2026-TUV-001 · TUVET IA · Corte: 31 de julio de 2026</w:t>
+        <w:t>Contrato COT-2026-TUV-001 · TUVET IA · Corte: 31 de julio de 2026 · Adenda: 3 de agosto · CORTE FINAL: 16 de agosto de 2026</w:t>
       </w:r>
     </w:p>
     <w:p>
@@ -514,6 +514,460 @@
           <w:sz w:val="18"/>
         </w:rPr>
         <w:t>4e45c00   31-jul   CASCADA EN EL AGENTE: deja de caerse por un solo proveedor</w:t>
+      </w:r>
+    </w:p>
+    <w:p>
+      <w:pPr>
+        <w:pStyle w:val="Heading2"/>
+      </w:pPr>
+      <w:r>
+        <w:t>Semana 5 — WhatsApp con tráfico real, calendario multi-proveedor (31 de julio al 3 de agosto)</w:t>
+      </w:r>
+    </w:p>
+    <w:p>
+      <w:pPr>
+        <w:ind w:left="360"/>
+      </w:pPr>
+      <w:r>
+        <w:rPr>
+          <w:rFonts w:ascii="Consolas" w:hAnsi="Consolas"/>
+          <w:sz w:val="18"/>
+        </w:rPr>
+        <w:t>2d1a7e5   31-jul   Bandeja en TIEMPO REAL: los mensajes entran al instante, no cada 15 s</w:t>
+      </w:r>
+    </w:p>
+    <w:p>
+      <w:pPr>
+        <w:ind w:left="360"/>
+      </w:pPr>
+      <w:r>
+        <w:rPr>
+          <w:rFonts w:ascii="Consolas" w:hAnsi="Consolas"/>
+          <w:sz w:val="18"/>
+        </w:rPr>
+        <w:t>57005b1   01-ago   La cascada registraba el modelo equivocado — la traza ya dice la verdad</w:t>
+      </w:r>
+    </w:p>
+    <w:p>
+      <w:pPr>
+        <w:ind w:left="360"/>
+      </w:pPr>
+      <w:r>
+        <w:rPr>
+          <w:rFonts w:ascii="Consolas" w:hAnsi="Consolas"/>
+          <w:sz w:val="18"/>
+        </w:rPr>
+        <w:t>1450614   02-ago   El modo auto de WhatsApp puede mirar la agenda y proponer citas</w:t>
+      </w:r>
+    </w:p>
+    <w:p>
+      <w:pPr>
+        <w:ind w:left="360"/>
+      </w:pPr>
+      <w:r>
+        <w:rPr>
+          <w:rFonts w:ascii="Consolas" w:hAnsi="Consolas"/>
+          <w:sz w:val="18"/>
+        </w:rPr>
+        <w:t>e9f9a80   02-ago   Permiso de ADMIN exigido en las tres acciones que salen de la clínica sin vuelta atrás</w:t>
+      </w:r>
+    </w:p>
+    <w:p>
+      <w:pPr>
+        <w:ind w:left="360"/>
+      </w:pPr>
+      <w:r>
+        <w:rPr>
+          <w:rFonts w:ascii="Consolas" w:hAnsi="Consolas"/>
+          <w:sz w:val="18"/>
+        </w:rPr>
+        <w:t>26dbb02   03-ago   Google Calendar por Composio, en vez de OAuth propio</w:t>
+      </w:r>
+    </w:p>
+    <w:p>
+      <w:pPr>
+        <w:ind w:left="360"/>
+      </w:pPr>
+      <w:r>
+        <w:rPr>
+          <w:rFonts w:ascii="Consolas" w:hAnsi="Consolas"/>
+          <w:sz w:val="18"/>
+        </w:rPr>
+        <w:t>767152f   03-ago   Outlook Calendar por Composio — una sola ruta para los dos proveedores</w:t>
+      </w:r>
+    </w:p>
+    <w:p>
+      <w:pPr>
+        <w:ind w:left="360"/>
+      </w:pPr>
+      <w:r>
+        <w:rPr>
+          <w:rFonts w:ascii="Consolas" w:hAnsi="Consolas"/>
+          <w:sz w:val="18"/>
+        </w:rPr>
+        <w:t>4e0f5ca   03-ago   El webhook de WhatsApp ya no descarta mensajes en silencio</w:t>
+      </w:r>
+    </w:p>
+    <w:p>
+      <w:pPr>
+        <w:ind w:left="360"/>
+      </w:pPr>
+      <w:r>
+        <w:rPr>
+          <w:rFonts w:ascii="Consolas" w:hAnsi="Consolas"/>
+          <w:sz w:val="18"/>
+        </w:rPr>
+        <w:t>53314eb   03-ago   Fotos en el hilo de WhatsApp: se ven, en orden, y /f/&lt;token&gt; ya no da 404</w:t>
+      </w:r>
+    </w:p>
+    <w:p>
+      <w:pPr>
+        <w:ind w:left="360"/>
+      </w:pPr>
+      <w:r>
+        <w:rPr>
+          <w:rFonts w:ascii="Consolas" w:hAnsi="Consolas"/>
+          <w:sz w:val="18"/>
+        </w:rPr>
+        <w:t>fdee418   03-ago   Un envío que falla lo dice en 20 segundos, no en 40</w:t>
+      </w:r>
+    </w:p>
+    <w:p>
+      <w:pPr>
+        <w:ind w:left="360"/>
+      </w:pPr>
+      <w:r>
+        <w:rPr>
+          <w:rFonts w:ascii="Consolas" w:hAnsi="Consolas"/>
+          <w:sz w:val="18"/>
+        </w:rPr>
+        <w:t>470a5a2   03-ago   Mandarse un mensaje al número de la propia clínica daba un 400 sin explicación</w:t>
+      </w:r>
+    </w:p>
+    <w:p>
+      <w:pPr>
+        <w:ind w:left="360"/>
+      </w:pPr>
+      <w:r>
+        <w:rPr>
+          <w:rFonts w:ascii="Consolas" w:hAnsi="Consolas"/>
+          <w:sz w:val="18"/>
+        </w:rPr>
+        <w:t>fc54fb8   03-ago   Normalización E.164: el número de la ficha sale con indicativo, y el error del proveedor se traduce</w:t>
+      </w:r>
+    </w:p>
+    <w:p>
+      <w:r>
+        <w:t>El 3 de agosto WhatsApp queda operando con tráfico real bidireccional en producción, tras corregir la configuración del servicio de transporte. El detalle, con su evidencia y sus límites, está en la Adenda del final.</w:t>
+      </w:r>
+    </w:p>
+    <w:p>
+      <w:pPr>
+        <w:pStyle w:val="Heading2"/>
+      </w:pPr>
+      <w:r>
+        <w:t>Semana 6 — correo unificado, el asistente en toda la app y el rediseño (3 al 12 de agosto)</w:t>
+      </w:r>
+    </w:p>
+    <w:p>
+      <w:pPr>
+        <w:ind w:left="360"/>
+      </w:pPr>
+      <w:r>
+        <w:rPr>
+          <w:rFonts w:ascii="Consolas" w:hAnsi="Consolas"/>
+          <w:sz w:val="18"/>
+        </w:rPr>
+        <w:t>7a2f115   03-ago   El health no miraba el correo, la tarjeta mentía y un envío fallido no dejaba rastro</w:t>
+      </w:r>
+    </w:p>
+    <w:p>
+      <w:pPr>
+        <w:ind w:left="360"/>
+      </w:pPr>
+      <w:r>
+        <w:rPr>
+          <w:rFonts w:ascii="Consolas" w:hAnsi="Consolas"/>
+          <w:sz w:val="18"/>
+        </w:rPr>
+        <w:t>30490d6   03-ago   La cobranza vuelve a leer las respuestas, ahora por Composio — IMAP se retira</w:t>
+      </w:r>
+    </w:p>
+    <w:p>
+      <w:pPr>
+        <w:ind w:left="360"/>
+      </w:pPr>
+      <w:r>
+        <w:rPr>
+          <w:rFonts w:ascii="Consolas" w:hAnsi="Consolas"/>
+          <w:sz w:val="18"/>
+        </w:rPr>
+        <w:t>5a6a370   03-ago   Athos alcanzable desde cualquier pantalla, sabiendo qué estás mirando</w:t>
+      </w:r>
+    </w:p>
+    <w:p>
+      <w:pPr>
+        <w:ind w:left="360"/>
+      </w:pPr>
+      <w:r>
+        <w:rPr>
+          <w:rFonts w:ascii="Consolas" w:hAnsi="Consolas"/>
+          <w:sz w:val="18"/>
+        </w:rPr>
+        <w:t>aaf9d28   03-ago   Cada propuesta registra de dónde vino, y cuánto cuesta cada superficie de IA</w:t>
+      </w:r>
+    </w:p>
+    <w:p>
+      <w:pPr>
+        <w:ind w:left="360"/>
+      </w:pPr>
+      <w:r>
+        <w:rPr>
+          <w:rFonts w:ascii="Consolas" w:hAnsi="Consolas"/>
+          <w:sz w:val="18"/>
+        </w:rPr>
+        <w:t>80046f4   11-ago   La invitación de equipo se envía por Resend, con botón propio</w:t>
+      </w:r>
+    </w:p>
+    <w:p>
+      <w:pPr>
+        <w:ind w:left="360"/>
+      </w:pPr>
+      <w:r>
+        <w:rPr>
+          <w:rFonts w:ascii="Consolas" w:hAnsi="Consolas"/>
+          <w:sz w:val="18"/>
+        </w:rPr>
+        <w:t>4fa7f64   11-ago   La grabación de una consulta ya no muere al cambiar de pantalla</w:t>
+      </w:r>
+    </w:p>
+    <w:p>
+      <w:pPr>
+        <w:ind w:left="360"/>
+      </w:pPr>
+      <w:r>
+        <w:rPr>
+          <w:rFonts w:ascii="Consolas" w:hAnsi="Consolas"/>
+          <w:sz w:val="18"/>
+        </w:rPr>
+        <w:t>a8de57f   11-ago   Rediseño: blanco y menta, y la barra lateral se parte en consultorio y CRM</w:t>
+      </w:r>
+    </w:p>
+    <w:p>
+      <w:pPr>
+        <w:ind w:left="360"/>
+      </w:pPr>
+      <w:r>
+        <w:rPr>
+          <w:rFonts w:ascii="Consolas" w:hAnsi="Consolas"/>
+          <w:sz w:val="18"/>
+        </w:rPr>
+        <w:t>5909a43   11-ago   Onboarding: un riel que dice qué le falta a la clínica</w:t>
+      </w:r>
+    </w:p>
+    <w:p>
+      <w:pPr>
+        <w:ind w:left="360"/>
+      </w:pPr>
+      <w:r>
+        <w:rPr>
+          <w:rFonts w:ascii="Consolas" w:hAnsi="Consolas"/>
+          <w:sz w:val="18"/>
+        </w:rPr>
+        <w:t>bd5ffec   12-ago   Athos primero — la app abre en la conversación, con la clínica al lado</w:t>
+      </w:r>
+    </w:p>
+    <w:p>
+      <w:pPr>
+        <w:ind w:left="360"/>
+      </w:pPr>
+      <w:r>
+        <w:rPr>
+          <w:rFonts w:ascii="Consolas" w:hAnsi="Consolas"/>
+          <w:sz w:val="18"/>
+        </w:rPr>
+        <w:t>e94c114   12-ago   El chat del asistente toma la forma familiar de ChatGPT</w:t>
+      </w:r>
+    </w:p>
+    <w:p>
+      <w:pPr>
+        <w:pStyle w:val="Heading2"/>
+      </w:pPr>
+      <w:r>
+        <w:t>Semana 7 — la consulta en vivo, seguridad y topes (15 y 16 de agosto)</w:t>
+      </w:r>
+    </w:p>
+    <w:p>
+      <w:pPr>
+        <w:ind w:left="360"/>
+      </w:pPr>
+      <w:r>
+        <w:rPr>
+          <w:rFonts w:ascii="Consolas" w:hAnsi="Consolas"/>
+          <w:sz w:val="18"/>
+        </w:rPr>
+        <w:t>462ed9e   15-ago   El cuaderno: durante la consulta el vet no tenía dónde escribir NADA</w:t>
+      </w:r>
+    </w:p>
+    <w:p>
+      <w:pPr>
+        <w:ind w:left="360"/>
+      </w:pPr>
+      <w:r>
+        <w:rPr>
+          <w:rFonts w:ascii="Consolas" w:hAnsi="Consolas"/>
+          <w:sz w:val="18"/>
+        </w:rPr>
+        <w:t>aae70ef   15-ago   «Iniciar consulta» ahora inicia la consulta: grabación, transcripto y cuaderno juntos</w:t>
+      </w:r>
+    </w:p>
+    <w:p>
+      <w:pPr>
+        <w:ind w:left="360"/>
+      </w:pPr>
+      <w:r>
+        <w:rPr>
+          <w:rFonts w:ascii="Consolas" w:hAnsi="Consolas"/>
+          <w:sz w:val="18"/>
+        </w:rPr>
+        <w:t>50e5216   15-ago   La alerta de alergia nombra el fármaco, y lo dice en el plan de la nota</w:t>
+      </w:r>
+    </w:p>
+    <w:p>
+      <w:pPr>
+        <w:ind w:left="360"/>
+      </w:pPr>
+      <w:r>
+        <w:rPr>
+          <w:rFonts w:ascii="Consolas" w:hAnsi="Consolas"/>
+          <w:sz w:val="18"/>
+        </w:rPr>
+        <w:t>8656e7a   16-ago   La nota decía «evidencia suficiente» cuando el juez dijo lo contrario</w:t>
+      </w:r>
+    </w:p>
+    <w:p>
+      <w:pPr>
+        <w:ind w:left="360"/>
+      </w:pPr>
+      <w:r>
+        <w:rPr>
+          <w:rFonts w:ascii="Consolas" w:hAnsi="Consolas"/>
+          <w:sz w:val="18"/>
+        </w:rPr>
+        <w:t>efeeb95   15-ago   La app no tenía ninguna red cuando algo se rompe: páginas de error en tres niveles</w:t>
+      </w:r>
+    </w:p>
+    <w:p>
+      <w:pPr>
+        <w:ind w:left="360"/>
+      </w:pPr>
+      <w:r>
+        <w:rPr>
+          <w:rFonts w:ascii="Consolas" w:hAnsi="Consolas"/>
+          <w:sz w:val="18"/>
+        </w:rPr>
+        <w:t>21d6eb5   15-ago   El modelo podía falsificar la marca que existe para controlarlo</w:t>
+      </w:r>
+    </w:p>
+    <w:p>
+      <w:pPr>
+        <w:ind w:left="360"/>
+      </w:pPr>
+      <w:r>
+        <w:rPr>
+          <w:rFonts w:ascii="Consolas" w:hAnsi="Consolas"/>
+          <w:sz w:val="18"/>
+        </w:rPr>
+        <w:t>dac3f1d   15-ago   Tope de gasto de IA por clínica, persistente entre lambdas</w:t>
+      </w:r>
+    </w:p>
+    <w:p>
+      <w:pPr>
+        <w:ind w:left="360"/>
+      </w:pPr>
+      <w:r>
+        <w:rPr>
+          <w:rFonts w:ascii="Consolas" w:hAnsi="Consolas"/>
+          <w:sz w:val="18"/>
+        </w:rPr>
+        <w:t>e67bd2e   15-ago   El vet ve cuánto cupo de IA le queda antes de topárselo</w:t>
+      </w:r>
+    </w:p>
+    <w:p>
+      <w:pPr>
+        <w:ind w:left="360"/>
+      </w:pPr>
+      <w:r>
+        <w:rPr>
+          <w:rFonts w:ascii="Consolas" w:hAnsi="Consolas"/>
+          <w:sz w:val="18"/>
+        </w:rPr>
+        <w:t>dea56b6   15-ago   Desactivar una cuenta la desactiva: gate en la base (migraciones 0059-0061)</w:t>
+      </w:r>
+    </w:p>
+    <w:p>
+      <w:pPr>
+        <w:ind w:left="360"/>
+      </w:pPr>
+      <w:r>
+        <w:rPr>
+          <w:rFonts w:ascii="Consolas" w:hAnsi="Consolas"/>
+          <w:sz w:val="18"/>
+        </w:rPr>
+        <w:t>5b6ff86   16-ago   El interruptor de desactivación en el panel de administración</w:t>
+      </w:r>
+    </w:p>
+    <w:p>
+      <w:pPr>
+        <w:ind w:left="360"/>
+      </w:pPr>
+      <w:r>
+        <w:rPr>
+          <w:rFonts w:ascii="Consolas" w:hAnsi="Consolas"/>
+          <w:sz w:val="18"/>
+        </w:rPr>
+        <w:t>5efed7f   16-ago   Desactivar también corta las APIs, no sólo las pantallas</w:t>
+      </w:r>
+    </w:p>
+    <w:p>
+      <w:pPr>
+        <w:ind w:left="360"/>
+      </w:pPr>
+      <w:r>
+        <w:rPr>
+          <w:rFonts w:ascii="Consolas" w:hAnsi="Consolas"/>
+          <w:sz w:val="18"/>
+        </w:rPr>
+        <w:t>ab80de5   16-ago   Un paciente creado ya se puede corregir: edición de la ficha</w:t>
+      </w:r>
+    </w:p>
+    <w:p>
+      <w:pPr>
+        <w:ind w:left="360"/>
+      </w:pPr>
+      <w:r>
+        <w:rPr>
+          <w:rFonts w:ascii="Consolas" w:hAnsi="Consolas"/>
+          <w:sz w:val="18"/>
+        </w:rPr>
+        <w:t>17a4caa   16-ago   El pago que el cliente ya entregó no puede perderse</w:t>
+      </w:r>
+    </w:p>
+    <w:p>
+      <w:pPr>
+        <w:ind w:left="360"/>
+      </w:pPr>
+      <w:r>
+        <w:rPr>
+          <w:rFonts w:ascii="Consolas" w:hAnsi="Consolas"/>
+          <w:sz w:val="18"/>
+        </w:rPr>
+        <w:t>de6b825   16-ago   El asistente sabe qué pantalla tenés delante — y quién espera en la clínica (d56a216)</w:t>
+      </w:r>
+    </w:p>
+    <w:p>
+      <w:r>
+        <w:t>El detalle de esta semana, con su evidencia y sus límites, está en la Segunda adenda del final.</w:t>
       </w:r>
     </w:p>
     <w:p>
@@ -2288,6 +2742,715 @@
         <w:pStyle w:val="Title"/>
       </w:pPr>
       <w:r>
+        <w:t>Adenda — corte del 3 de agosto de 2026</w:t>
+      </w:r>
+    </w:p>
+    <w:p>
+      <w:r>
+        <w:t>Lo de abajo es evidencia posterior al corte del 31 de julio, tomada el 3 de agosto sobre producción con los mismos criterios del resto del documento: se dice qué clase de evidencia respalda cada afirmación, y dónde está el límite.</w:t>
+      </w:r>
+    </w:p>
+    <w:p>
+      <w:pPr>
+        <w:pStyle w:val="Heading1"/>
+      </w:pPr>
+      <w:r>
+        <w:t>Adenda A — WhatsApp: transporte verificado con tráfico real</w:t>
+      </w:r>
+    </w:p>
+    <w:p>
+      <w:r>
+        <w:t>QUÉ ESTABA FALLANDO. El transporte de WhatsApp (Evolution, elegido el 28 de julio con consentimiento registrado de la clínica) corría sin su cache configurado: la sesión figuraba «conectada» pero no procesaba ni un mensaje — cero filas en la tabla de mensajes en toda su historia, y cero también en la base interna del propio transporte. El diagnóstico se hizo por capas y con evidencia en cada una: webhook registrado con URL y token correctos (probado con una petición real → 200), ruta desplegada, y el hueco aislado aguas arriba, en el servicio de transporte.</w:t>
+      </w:r>
+    </w:p>
+    <w:p>
+      <w:r>
+        <w:t>LA CORRECCIÓN. Configuración del servicio (3 de agosto), no código. El mismo día quedó fluyendo tráfico real bidireccional: mensajes entrantes de un teléfono real, respuestas desde la bandeja, y la sincronización de lo que el veterinario escribe desde su propio teléfono (evidencia de estado: filas inbound y outbound del 3 de agosto en whatsapp_messages, con cero fallidas de transporte).</w:t>
+      </w:r>
+    </w:p>
+    <w:p>
+      <w:r>
+        <w:t>QUÉ MÁS QUEDÓ CERRADO EL MISMO DÍA (evidencia documental): el webhook ya no puede descartar mensajes en silencio — cada evento deja una línea de log con su motivo (4e0f5ca); las fotos se ven en el hilo, en orden, y la ruta /f/&lt;token&gt; existe (53314eb); un envío que falla lo dice en ~20 segundos con un mensaje que explica el motivo (fdee418, d632fb3).</w:t>
+      </w:r>
+    </w:p>
+    <w:p>
+      <w:pPr>
+        <w:pStyle w:val="Heading2"/>
+      </w:pPr>
+      <w:r>
+        <w:t>Límites de la evidencia</w:t>
+      </w:r>
+    </w:p>
+    <w:p>
+      <w:pPr>
+        <w:ind w:left="480"/>
+      </w:pPr>
+      <w:r>
+        <w:rPr>
+          <w:i/>
+          <w:color w:val="444444"/>
+        </w:rPr>
+        <w:t>Los envíos que parten de la ficha del titular fallaban si el teléfono estaba guardado sin indicativo de país: el 3 de agosto quedaron dos acciones failed con el error íntegro y verificable en athos_actions.error (el transporte responde exists:false para el número sin 57). QUEDÓ CORREGIDO ESE MISMO DÍA: la normalización E.164 en el único camino de salida, y el error crudo del proveedor traducido a un mensaje que explica el motivo (fc54fb8). Las respuestas desde la bandeja nunca lo necesitaron porque responden a números que llegaron por webhook, ya completos.</w:t>
+      </w:r>
+    </w:p>
+    <w:p>
+      <w:pPr>
+        <w:ind w:left="480"/>
+      </w:pPr>
+      <w:r>
+        <w:rPr>
+          <w:i/>
+          <w:color w:val="444444"/>
+        </w:rPr>
+        <w:t>El botón «Sugerir» de la bandeja registró su primer uso real el 3 de agosto sin producir propuesta; está en diagnóstico (la cascada del agente resolvió a un modelo distinto del previsto para superficies con herramientas).</w:t>
+      </w:r>
+    </w:p>
+    <w:p>
+      <w:pPr>
+        <w:ind w:left="480"/>
+      </w:pPr>
+      <w:r>
+        <w:rPr>
+          <w:i/>
+          <w:color w:val="444444"/>
+        </w:rPr>
+        <w:t>El modo auto responde únicamente saludos, horarios y citas; ante cualquier cosa clínica CALLA POR DISEÑO y el mensaje queda para el veterinario. Además arranca con rampa anti-baneo (5 respuestas/día el primer día). Un silencio ante una pregunta clínica es la salvaguarda operando, no un defecto.</w:t>
+      </w:r>
+    </w:p>
+    <w:p>
+      <w:pPr>
+        <w:pStyle w:val="Heading1"/>
+      </w:pPr>
+      <w:r>
+        <w:t>Adenda B — Calendario: de OAuth propio a Composio, y ahora también Outlook</w:t>
+      </w:r>
+    </w:p>
+    <w:p>
+      <w:r>
+        <w:t>El 3 de agosto la integración de calendario migró a Composio (26dbb02) y se añadió Outlook Calendar por la misma ruta (767152f): un solo camino de código para los dos proveedores. Quedaron corregidos además tres defectos de ruteo: la cita va al calendario del ADMINISTRADOR con el veterinario invitado (3e96aa8), la pantalla de conexiones muestra el calendario DE LA CLÍNICA y no el de quien mira (23b116f), y una cita que no llega al calendario AVISA en vez de fallar en silencio (032982d). La conexión es por miembro, no por clínica: cada uno usa su propia cuenta.</w:t>
+      </w:r>
+    </w:p>
+    <w:p>
+      <w:pPr>
+        <w:pStyle w:val="Heading1"/>
+      </w:pPr>
+      <w:r>
+        <w:t>Adenda C — Verificación pre-demo del 3 de agosto (evidencia de estado y comportamiento)</w:t>
+      </w:r>
+    </w:p>
+    <w:p>
+      <w:r>
+        <w:t>Verificación completa de producción la mañana del 3 de agosto:</w:t>
+      </w:r>
+    </w:p>
+    <w:tbl>
+      <w:tblPr>
+        <w:tblStyle w:val="LightGrid-Accent1"/>
+        <w:tblW w:type="auto" w:w="0"/>
+        <w:tblLook w:firstColumn="1" w:firstRow="1" w:lastColumn="0" w:lastRow="0" w:noHBand="0" w:noVBand="1" w:val="04A0"/>
+      </w:tblPr>
+      <w:tblGrid>
+        <w:gridCol w:w="4320"/>
+        <w:gridCol w:w="4320"/>
+      </w:tblGrid>
+      <w:tr>
+        <w:tc>
+          <w:tcPr>
+            <w:tcW w:type="dxa" w:w="4320"/>
+          </w:tcPr>
+          <w:p>
+            <w:r>
+              <w:rPr>
+                <w:b/>
+              </w:rPr>
+              <w:t>Qué</w:t>
+            </w:r>
+          </w:p>
+        </w:tc>
+        <w:tc>
+          <w:tcPr>
+            <w:tcW w:type="dxa" w:w="4320"/>
+          </w:tcPr>
+          <w:p>
+            <w:r>
+              <w:rPr>
+                <w:b/>
+              </w:rPr>
+              <w:t>Resultado</w:t>
+            </w:r>
+          </w:p>
+        </w:tc>
+      </w:tr>
+      <w:tr>
+        <w:tc>
+          <w:tcPr>
+            <w:tcW w:type="dxa" w:w="4320"/>
+          </w:tcPr>
+          <w:p>
+            <w:r>
+              <w:t>Backend /health</w:t>
+            </w:r>
+          </w:p>
+        </w:tc>
+        <w:tc>
+          <w:tcPr>
+            <w:tcW w:type="dxa" w:w="4320"/>
+          </w:tcPr>
+          <w:p>
+            <w:r>
+              <w:t>200 en 0,5 s</w:t>
+            </w:r>
+          </w:p>
+        </w:tc>
+      </w:tr>
+      <w:tr>
+        <w:tc>
+          <w:tcPr>
+            <w:tcW w:type="dxa" w:w="4320"/>
+          </w:tcPr>
+          <w:p>
+            <w:r>
+              <w:t>Endpoints protegidos sin credencial</w:t>
+            </w:r>
+          </w:p>
+        </w:tc>
+        <w:tc>
+          <w:tcPr>
+            <w:tcW w:type="dxa" w:w="4320"/>
+          </w:tcPr>
+          <w:p>
+            <w:r>
+              <w:t>401 (el gate de auth opera)</w:t>
+            </w:r>
+          </w:p>
+        </w:tc>
+      </w:tr>
+      <w:tr>
+        <w:tc>
+          <w:tcPr>
+            <w:tcW w:type="dxa" w:w="4320"/>
+          </w:tcPr>
+          <w:p>
+            <w:r>
+              <w:t>CORS desde el dominio del frontend</w:t>
+            </w:r>
+          </w:p>
+        </w:tc>
+        <w:tc>
+          <w:tcPr>
+            <w:tcW w:type="dxa" w:w="4320"/>
+          </w:tcPr>
+          <w:p>
+            <w:r>
+              <w:t>aceptado para el origen exacto</w:t>
+            </w:r>
+          </w:p>
+        </w:tc>
+      </w:tr>
+      <w:tr>
+        <w:tc>
+          <w:tcPr>
+            <w:tcW w:type="dxa" w:w="4320"/>
+          </w:tcPr>
+          <w:p>
+            <w:r>
+              <w:t>Pipeline RAG completo (petición real autenticada)</w:t>
+            </w:r>
+          </w:p>
+        </w:tc>
+        <w:tc>
+          <w:tcPr>
+            <w:tcW w:type="dxa" w:w="4320"/>
+          </w:tcPr>
+          <w:p>
+            <w:r>
+              <w:t>200 con evidence_level y 8 fragmentos con fuente y localizador</w:t>
+            </w:r>
+          </w:p>
+        </w:tc>
+      </w:tr>
+      <w:tr>
+        <w:tc>
+          <w:tcPr>
+            <w:tcW w:type="dxa" w:w="4320"/>
+          </w:tcPr>
+          <w:p>
+            <w:r>
+              <w:t>Latencia del pipeline RAG</w:t>
+            </w:r>
+          </w:p>
+        </w:tc>
+        <w:tc>
+          <w:tcPr>
+            <w:tcW w:type="dxa" w:w="4320"/>
+          </w:tcPr>
+          <w:p>
+            <w:r>
+              <w:t>6,5 s en caliente · 19,9 s la primera consulta en frío</w:t>
+            </w:r>
+          </w:p>
+        </w:tc>
+      </w:tr>
+      <w:tr>
+        <w:tc>
+          <w:tcPr>
+            <w:tcW w:type="dxa" w:w="4320"/>
+          </w:tcPr>
+          <w:p>
+            <w:r>
+              <w:t>Corpus en producción</w:t>
+            </w:r>
+          </w:p>
+        </w:tc>
+        <w:tc>
+          <w:tcPr>
+            <w:tcW w:type="dxa" w:w="4320"/>
+          </w:tcPr>
+          <w:p>
+            <w:r>
+              <w:t>~519.900 fragmentos indexados</w:t>
+            </w:r>
+          </w:p>
+        </w:tc>
+      </w:tr>
+      <w:tr>
+        <w:tc>
+          <w:tcPr>
+            <w:tcW w:type="dxa" w:w="4320"/>
+          </w:tcPr>
+          <w:p>
+            <w:r>
+              <w:t>Datos de demostración en la cuenta del cliente</w:t>
+            </w:r>
+          </w:p>
+        </w:tc>
+        <w:tc>
+          <w:tcPr>
+            <w:tcW w:type="dxa" w:w="4320"/>
+          </w:tcPr>
+          <w:p>
+            <w:r>
+              <w:t>22 pacientes, 24 notas (7 borradores por aprobar), 11 consultas listas para el Modo Fantasma, 8 alergias (3 severas), memoria de paciente indexada</w:t>
+            </w:r>
+          </w:p>
+        </w:tc>
+      </w:tr>
+    </w:tbl>
+    <w:p/>
+    <w:p>
+      <w:pPr>
+        <w:ind w:left="480"/>
+      </w:pPr>
+      <w:r>
+        <w:rPr>
+          <w:i/>
+          <w:color w:val="444444"/>
+        </w:rPr>
+        <w:t>Límite: la cifra de latencia en frío importa operativamente — la primera consulta tras un rato de inactividad tarda ~20 s. Para una demostración conviene hacer una consulta de calentamiento minutos antes.</w:t>
+      </w:r>
+    </w:p>
+    <w:p>
+      <w:r>
+        <w:br w:type="page"/>
+      </w:r>
+    </w:p>
+    <w:p>
+      <w:pPr>
+        <w:pStyle w:val="Title"/>
+      </w:pPr>
+      <w:r>
+        <w:t>Segunda adenda — corte final del 16 de agosto de 2026</w:t>
+      </w:r>
+    </w:p>
+    <w:p>
+      <w:r>
+        <w:t>Trabajo posterior al 3 de agosto, con la misma regla del resto del documento: cada afirmación dice qué clase de evidencia la respalda, y dónde está el límite.</w:t>
+      </w:r>
+    </w:p>
+    <w:p>
+      <w:pPr>
+        <w:pStyle w:val="Heading1"/>
+      </w:pPr>
+      <w:r>
+        <w:t>Adenda D — La consulta en vivo: una sola superficie para grabar, escribir y firmar</w:t>
+      </w:r>
+    </w:p>
+    <w:p>
+      <w:r>
+        <w:t>Hasta el 15 de agosto la consulta estaba repartida: TRES superficies de grabación distintas, DOS cuadernos que no se hablaban entre sí, y ningún lugar donde el veterinario escribiera durante la consulta. El 15 de agosto se unificó (bb8a1d4, 84ee87c, aae70ef): «iniciar consulta» inicia la grabación con el transcripto en vivo y el cuaderno lado a lado, la grabación sobrevive al cambio de pantalla (4fa7f64), y el cuaderno persiste en la base (migración 0058, con pruebas propias en el servicio y en el front). De 3-4 clics entre «quiero grabar» y «grabando» quedaron 2.</w:t>
+      </w:r>
+    </w:p>
+    <w:p>
+      <w:r>
+        <w:t>Además la nota ganó dos garantías (evidencia documental): la alerta de alergia NOMBRA EL FÁRMACO y lo dice en el plan, que es donde el vet decide (50e5216); y la nota ya no puede decir «evidencia suficiente» cuando el juez de abstención dictaminó lo contrario (8656e7a) — la etiqueta sale del veredicto real, no de un texto fijo.</w:t>
+      </w:r>
+    </w:p>
+    <w:p>
+      <w:pPr>
+        <w:pStyle w:val="Heading1"/>
+      </w:pPr>
+      <w:r>
+        <w:t>Adenda E — Seguridad y antifraude: la fase 1 operando, y lo que falta dicho de frente</w:t>
+      </w:r>
+    </w:p>
+    <w:p>
+      <w:r>
+        <w:t>Lo construido entre el 15 y el 16 de agosto (evidencia documental y de estado):</w:t>
+      </w:r>
+    </w:p>
+    <w:p>
+      <w:pPr>
+        <w:pStyle w:val="ListBullet"/>
+      </w:pPr>
+      <w:r>
+        <w:t>Desactivar una cuenta la desactiva. El gate vive en la base (migraciones 0059-0061), verificado contra el Postgres de producción con 7 comprobaciones en OK. El bypass por PATCH del propio usuario quedó cerrado (93b6aac, 0060), las APIs también se cortan —no sólo las pantallas— (5efed7f), y el panel de administración tiene el interruptor (5b6ff86).</w:t>
+      </w:r>
+    </w:p>
+    <w:p>
+      <w:pPr>
+        <w:pStyle w:val="ListBullet"/>
+      </w:pPr>
+      <w:r>
+        <w:t>El modelo no puede falsificar la marca que existe para controlarlo (21d6eb5): la tarjeta de aprobación es del código, no del texto del modelo.</w:t>
+      </w:r>
+    </w:p>
+    <w:p>
+      <w:pPr>
+        <w:pStyle w:val="ListBullet"/>
+      </w:pPr>
+      <w:r>
+        <w:t>Permiso de ADMIN exigido en las tres acciones que salen de la clínica sin vuelta atrás (e9f9a80, del 2 de agosto).</w:t>
+      </w:r>
+    </w:p>
+    <w:p>
+      <w:pPr>
+        <w:pStyle w:val="ListBullet"/>
+      </w:pPr>
+      <w:r>
+        <w:t>El panel de administración muestra el costo real por tokens (/admin/costos) y los usuarios con su última fecha de ingreso, incluida la señal «nunca entró».</w:t>
+      </w:r>
+    </w:p>
+    <w:p>
+      <w:pPr>
+        <w:pStyle w:val="Heading2"/>
+      </w:pPr>
+      <w:r>
+        <w:t>Límites de la evidencia</w:t>
+      </w:r>
+    </w:p>
+    <w:p>
+      <w:pPr>
+        <w:ind w:left="480"/>
+      </w:pPr>
+      <w:r>
+        <w:rPr>
+          <w:i/>
+          <w:color w:val="444444"/>
+        </w:rPr>
+        <w:t>La desactivación automática NO EXISTE: no hay ningún cron que desactive por señales. Hoy es un interruptor manual.</w:t>
+      </w:r>
+    </w:p>
+    <w:p>
+      <w:pPr>
+        <w:ind w:left="480"/>
+      </w:pPr>
+      <w:r>
+        <w:rPr>
+          <w:i/>
+          <w:color w:val="444444"/>
+        </w:rPr>
+        <w:t>Las señales de abuso (correos parecidos, direcciones IP) no están construidas. El plan completo está en docs/ANTIFRAUDE-2026-08-15.md, que documenta también qué señales dependen de la retención de logs de autenticación.</w:t>
+      </w:r>
+    </w:p>
+    <w:p>
+      <w:pPr>
+        <w:pStyle w:val="Heading1"/>
+      </w:pPr>
+      <w:r>
+        <w:t>Adenda F — El tope de gasto de IA: construido, y hoy apagado a propósito</w:t>
+      </w:r>
+    </w:p>
+    <w:p>
+      <w:r>
+        <w:t>El 15 de agosto se construyó el tope mensual de gasto de IA por clínica (dac3f1d, 6f3f8b6): persiste en la base —sobrevive a la siguiente lambda—, las SEIS superficies que consumen IA pasan por él (chat, bandeja, modo automático, cartera y las dos de visión), y el veterinario VE CUÁNTO LE QUEDA antes de topárselo (e67bd2e), en vez de un corte a ciegas.</w:t>
+      </w:r>
+    </w:p>
+    <w:p>
+      <w:pPr>
+        <w:pStyle w:val="Heading2"/>
+      </w:pPr>
+      <w:r>
+        <w:t>Límite de la evidencia</w:t>
+      </w:r>
+    </w:p>
+    <w:p>
+      <w:pPr>
+        <w:ind w:left="480"/>
+      </w:pPr>
+      <w:r>
+        <w:rPr>
+          <w:i/>
+          <w:color w:val="444444"/>
+        </w:rPr>
+        <w:t>Verificado el 16 de agosto contra las variables de producción de Vercel: ATHOS_TOPE_MENSUAL_POR_CLINICA no está configurada, así que hoy el tope NO CORTA NADA. Es deliberado — el acta tiene abierta la decisión del límite exacto entre el plan gratuito y el de pago — pero mientras esa decisión no se tome, el único freno vivo es el límite de peticiones por minuto. Encenderlo es poner una variable, sin redespliegue de código.</w:t>
+      </w:r>
+    </w:p>
+    <w:p>
+      <w:pPr>
+        <w:pStyle w:val="Heading1"/>
+      </w:pPr>
+      <w:r>
+        <w:t>Adenda G — El rediseño, el asistente en el centro, y la salud del código al corte final</w:t>
+      </w:r>
+    </w:p>
+    <w:p>
+      <w:r>
+        <w:t>Entre el 11 y el 16 de agosto la interfaz cambió de forma (evidencia documental): blanco y menta con la barra partida en consultorio y CRM (a8de57f), la app abre en la conversación con Athos y la clínica al lado (bd5ffec), el chat toma la forma familiar de ChatGPT (e94c114), tab bar en el teléfono (87d2fed), páginas de error en tres niveles donde antes no había ninguna (efeeb95), y un riel de onboarding que dice qué le falta a la clínica (5909a43). El asistente además SABE QUÉ PANTALLA TENÉS DELANTE (de6b825) y QUIÉN ESTÁ ESPERANDO EN LA CLÍNICA, sin gastar un token (d56a216).</w:t>
+      </w:r>
+    </w:p>
+    <w:p>
+      <w:r>
+        <w:t>Salud del código al corte, medida el 16 de agosto (docs/DIAGNOSTICO-2026-08-16.md):</w:t>
+      </w:r>
+    </w:p>
+    <w:tbl>
+      <w:tblPr>
+        <w:tblStyle w:val="LightGrid-Accent1"/>
+        <w:tblW w:type="auto" w:w="0"/>
+        <w:tblLook w:firstColumn="1" w:firstRow="1" w:lastColumn="0" w:lastRow="0" w:noHBand="0" w:noVBand="1" w:val="04A0"/>
+      </w:tblPr>
+      <w:tblGrid>
+        <w:gridCol w:w="4320"/>
+        <w:gridCol w:w="4320"/>
+      </w:tblGrid>
+      <w:tr>
+        <w:tc>
+          <w:tcPr>
+            <w:tcW w:type="dxa" w:w="4320"/>
+          </w:tcPr>
+          <w:p>
+            <w:r>
+              <w:rPr>
+                <w:b/>
+              </w:rPr>
+              <w:t>Qué</w:t>
+            </w:r>
+          </w:p>
+        </w:tc>
+        <w:tc>
+          <w:tcPr>
+            <w:tcW w:type="dxa" w:w="4320"/>
+          </w:tcPr>
+          <w:p>
+            <w:r>
+              <w:rPr>
+                <w:b/>
+              </w:rPr>
+              <w:t>Resultado</w:t>
+            </w:r>
+          </w:p>
+        </w:tc>
+      </w:tr>
+      <w:tr>
+        <w:tc>
+          <w:tcPr>
+            <w:tcW w:type="dxa" w:w="4320"/>
+          </w:tcPr>
+          <w:p>
+            <w:r>
+              <w:t>Errores de tipos (tsc --noEmit)</w:t>
+            </w:r>
+          </w:p>
+        </w:tc>
+        <w:tc>
+          <w:tcPr>
+            <w:tcW w:type="dxa" w:w="4320"/>
+          </w:tcPr>
+          <w:p>
+            <w:r>
+              <w:t>0</w:t>
+            </w:r>
+          </w:p>
+        </w:tc>
+      </w:tr>
+      <w:tr>
+        <w:tc>
+          <w:tcPr>
+            <w:tcW w:type="dxa" w:w="4320"/>
+          </w:tcPr>
+          <w:p>
+            <w:r>
+              <w:t>Avisos de lint (eslint --max-warnings=0)</w:t>
+            </w:r>
+          </w:p>
+        </w:tc>
+        <w:tc>
+          <w:tcPr>
+            <w:tcW w:type="dxa" w:w="4320"/>
+          </w:tcPr>
+          <w:p>
+            <w:r>
+              <w:t>0</w:t>
+            </w:r>
+          </w:p>
+        </w:tc>
+      </w:tr>
+      <w:tr>
+        <w:tc>
+          <w:tcPr>
+            <w:tcW w:type="dxa" w:w="4320"/>
+          </w:tcPr>
+          <w:p>
+            <w:r>
+              <w:t>Pruebas del front</w:t>
+            </w:r>
+          </w:p>
+        </w:tc>
+        <w:tc>
+          <w:tcPr>
+            <w:tcW w:type="dxa" w:w="4320"/>
+          </w:tcPr>
+          <w:p>
+            <w:r>
+              <w:t>743 en 69 archivos, todas en verde</w:t>
+            </w:r>
+          </w:p>
+        </w:tc>
+      </w:tr>
+      <w:tr>
+        <w:tc>
+          <w:tcPr>
+            <w:tcW w:type="dxa" w:w="4320"/>
+          </w:tcPr>
+          <w:p>
+            <w:r>
+              <w:t>Pruebas del servicio</w:t>
+            </w:r>
+          </w:p>
+        </w:tc>
+        <w:tc>
+          <w:tcPr>
+            <w:tcW w:type="dxa" w:w="4320"/>
+          </w:tcPr>
+          <w:p>
+            <w:r>
+              <w:t>261 en verde</w:t>
+            </w:r>
+          </w:p>
+        </w:tc>
+      </w:tr>
+      <w:tr>
+        <w:tc>
+          <w:tcPr>
+            <w:tcW w:type="dxa" w:w="4320"/>
+          </w:tcPr>
+          <w:p>
+            <w:r>
+              <w:t>Build de producción</w:t>
+            </w:r>
+          </w:p>
+        </w:tc>
+        <w:tc>
+          <w:tcPr>
+            <w:tcW w:type="dxa" w:w="4320"/>
+          </w:tcPr>
+          <w:p>
+            <w:r>
+              <w:t>OK</w:t>
+            </w:r>
+          </w:p>
+        </w:tc>
+      </w:tr>
+      <w:tr>
+        <w:tc>
+          <w:tcPr>
+            <w:tcW w:type="dxa" w:w="4320"/>
+          </w:tcPr>
+          <w:p>
+            <w:r>
+              <w:t>Rutas del dashboard sin enlace entrante</w:t>
+            </w:r>
+          </w:p>
+        </w:tc>
+        <w:tc>
+          <w:tcPr>
+            <w:tcW w:type="dxa" w:w="4320"/>
+          </w:tcPr>
+          <w:p>
+            <w:r>
+              <w:t>0 de 32</w:t>
+            </w:r>
+          </w:p>
+        </w:tc>
+      </w:tr>
+    </w:tbl>
+    <w:p/>
+    <w:p>
+      <w:pPr>
+        <w:pStyle w:val="Heading2"/>
+      </w:pPr>
+      <w:r>
+        <w:t>Límites de la evidencia</w:t>
+      </w:r>
+    </w:p>
+    <w:p>
+      <w:pPr>
+        <w:ind w:left="480"/>
+      </w:pPr>
+      <w:r>
+        <w:rPr>
+          <w:i/>
+          <w:color w:val="444444"/>
+        </w:rPr>
+        <w:t>La medición es del commit aae70ef (15-ago); los commits del 16 añadieron MÁS pruebas (entre ellas, la primera suite de la ruta que ejecuta acciones: 32d72c2), así que el número real al corte es mayor, no menor.</w:t>
+      </w:r>
+    </w:p>
+    <w:p>
+      <w:pPr>
+        <w:ind w:left="480"/>
+      </w:pPr>
+      <w:r>
+        <w:rPr>
+          <w:i/>
+          <w:color w:val="444444"/>
+        </w:rPr>
+        <w:t>Lo VISUAL del rediseño (radios, espaciados, el layout de la consulta) no se verificó a ojo en esta máquina: está cubierto por tipos, lint, pruebas y build, y debe mirarse en el despliegue de producción.</w:t>
+      </w:r>
+    </w:p>
+    <w:p>
+      <w:pPr>
+        <w:ind w:left="480"/>
+      </w:pPr>
+      <w:r>
+        <w:rPr>
+          <w:i/>
+          <w:color w:val="444444"/>
+        </w:rPr>
+        <w:t>El botón «Sugerir» de la bandeja de WhatsApp sigue EN DIAGNÓSTICO desde el 3 de agosto (ver Adenda A). Desde aaf9d28 cada propuesta registra su procedencia y su costo, que es el instrumento para ese diagnóstico.</w:t>
+      </w:r>
+    </w:p>
+    <w:p>
+      <w:pPr>
+        <w:ind w:left="480"/>
+      </w:pPr>
+      <w:r>
+        <w:rPr>
+          <w:i/>
+          <w:color w:val="444444"/>
+        </w:rPr>
+        <w:t>El CORREO migró: la lectura de respuestas de cobranza ya no es IMAP sino Composio (30490d6, 3-ago). El Punto 6 describe el estado al 31 de julio; la arquitectura vigente es la de Composio.</w:t>
+      </w:r>
+    </w:p>
+    <w:p>
+      <w:r>
+        <w:br w:type="page"/>
+      </w:r>
+    </w:p>
+    <w:p>
+      <w:pPr>
+        <w:pStyle w:val="Title"/>
+      </w:pPr>
+      <w:r>
         <w:t>El método — por qué se avanzó en ese orden</w:t>
       </w:r>
     </w:p>
@@ -3064,6 +4227,87 @@
           <w:color w:val="444444"/>
         </w:rPr>
         <w:t>Lo que prueba: que el historial persiste entre sesiones. La recarga es la parte importante: sin ella no se demuestra persistencia.</w:t>
+      </w:r>
+    </w:p>
+    <w:p>
+      <w:pPr>
+        <w:jc w:val="center"/>
+      </w:pPr>
+      <w:r>
+        <w:rPr>
+          <w:i/>
+          <w:color w:val="999999"/>
+        </w:rPr>
+        <w:t>[ Espacio para pegar el video o su captura ]</w:t>
+      </w:r>
+    </w:p>
+    <w:p/>
+    <w:p>
+      <w:pPr>
+        <w:pStyle w:val="Heading2"/>
+      </w:pPr>
+      <w:r>
+        <w:t>P06b · WhatsApp en vivo  (2 a 3 minutos)</w:t>
+      </w:r>
+    </w:p>
+    <w:p>
+      <w:pPr>
+        <w:pStyle w:val="ListBullet"/>
+      </w:pPr>
+      <w:r>
+        <w:t>Mostrá la bandeja de Comunicaciones en la URL de producción, con el reloj visible.</w:t>
+      </w:r>
+    </w:p>
+    <w:p>
+      <w:pPr>
+        <w:pStyle w:val="ListBullet"/>
+      </w:pPr>
+      <w:r>
+        <w:t>Desde un teléfono, enviá un WhatsApp al número conectado de la clínica y decí antes qué vas a escribir.</w:t>
+      </w:r>
+    </w:p>
+    <w:p>
+      <w:pPr>
+        <w:pStyle w:val="ListBullet"/>
+      </w:pPr>
+      <w:r>
+        <w:t>Mostrá el mensaje apareciendo en la bandeja AL INSTANTE (sin recargar: la bandeja es en tiempo real).</w:t>
+      </w:r>
+    </w:p>
+    <w:p>
+      <w:pPr>
+        <w:pStyle w:val="ListBullet"/>
+      </w:pPr>
+      <w:r>
+        <w:t>Respondé desde la bandeja y mostrá el teléfono recibiendo la respuesta.</w:t>
+      </w:r>
+    </w:p>
+    <w:p>
+      <w:pPr>
+        <w:pStyle w:val="ListBullet"/>
+      </w:pPr>
+      <w:r>
+        <w:t>Mandá una FOTO desde el teléfono y mostrá que se ve en el hilo.</w:t>
+      </w:r>
+    </w:p>
+    <w:p>
+      <w:pPr>
+        <w:pStyle w:val="ListBullet"/>
+      </w:pPr>
+      <w:r>
+        <w:t>Escribí un mensaje desde el teléfono de la clínica (no desde la plataforma) y mostrá que también aparece en el hilo: es la sincronización completa del número.</w:t>
+      </w:r>
+    </w:p>
+    <w:p>
+      <w:pPr>
+        <w:ind w:left="480"/>
+      </w:pPr>
+      <w:r>
+        <w:rPr>
+          <w:i/>
+          <w:color w:val="444444"/>
+        </w:rPr>
+        <w:t>Lo que prueba: el ciclo entero de WhatsApp operando en producción — entrante en tiempo real, respuesta, media y sincronización del teléfono propio. Es la evidencia de comportamiento que respalda la Adenda A.</w:t>
       </w:r>
     </w:p>
     <w:p>
@@ -3335,6 +4579,54 @@
       </w:pPr>
       <w:r>
         <w:t>INVENTARIO-COMPONENTES.md — inventario formal de componentes</w:t>
+      </w:r>
+    </w:p>
+    <w:p>
+      <w:pPr>
+        <w:pStyle w:val="ListBullet"/>
+      </w:pPr>
+      <w:r>
+        <w:t>docs/entrega/CAPA-AGENTICA-ESTADO.md — las 21 habilidades del asistente, cada una con su frase de prueba y el resultado esperado</w:t>
+      </w:r>
+    </w:p>
+    <w:p>
+      <w:pPr>
+        <w:pStyle w:val="ListBullet"/>
+      </w:pPr>
+      <w:r>
+        <w:t>docs/EVOLUTION.md — operación del transporte de WhatsApp (decisión, riesgos y consentimiento)</w:t>
+      </w:r>
+    </w:p>
+    <w:p>
+      <w:pPr>
+        <w:pStyle w:val="ListBullet"/>
+      </w:pPr>
+      <w:r>
+        <w:t>WHATSAPP.md — arquitectura de la capa de WhatsApp multi-proveedor</w:t>
+      </w:r>
+    </w:p>
+    <w:p>
+      <w:pPr>
+        <w:pStyle w:val="ListBullet"/>
+      </w:pPr>
+      <w:r>
+        <w:t>FUNCIONALIDADES.md — mapa completo de funcionalidades, con el costo de operación de cada una</w:t>
+      </w:r>
+    </w:p>
+    <w:p>
+      <w:pPr>
+        <w:pStyle w:val="ListBullet"/>
+      </w:pPr>
+      <w:r>
+        <w:t>docs/ANTIFRAUDE-2026-08-15.md — el plan antifraude: qué está construido y qué señales faltan</w:t>
+      </w:r>
+    </w:p>
+    <w:p>
+      <w:pPr>
+        <w:pStyle w:val="ListBullet"/>
+      </w:pPr>
+      <w:r>
+        <w:t>docs/DIAGNOSTICO-2026-08-16.md — diagnóstico de cableado, UI y base de datos al corte final</w:t>
       </w:r>
     </w:p>
     <w:sectPr>

</xml_diff>